<commit_message>
Correct the methods note and match the AI report typography
The buffer distance is uniform across species. The buffered polygon is not,
since it follows each species' own range boundary. The previous wording
conflated the two. Headings and body now use the same faces and sizes as
the narrative section: 14pt Calibri Bold, 11pt Calibri Bold, 11pt Cambria.

Co-Authored-By: Claude Opus 5 <noreply@anthropic.com>
</commit_message>
<xml_diff>
--- a/inst/resources/methods.docx
+++ b/inst/resources/methods.docx
@@ -6,7 +6,7 @@
       <w:pPr>
         <w:pStyle w:val="Heading1"/>
         <w:bidi w:val="0"/>
-        <w:spacing w:before="240" w:after="240"/>
+        <w:spacing w:before="240" w:after="160"/>
         <w:jc w:val="left"/>
         <w:rPr/>
       </w:pPr>
@@ -31,11 +31,12 @@
       <w:pPr>
         <w:pStyle w:val="BodyText"/>
         <w:bidi w:val="0"/>
-        <w:rPr/>
-      </w:pPr>
-      <w:r>
-        <w:rPr/>
-        <w:t>The modeled extent is a rectangular bounding box enclosing the USGS GAP range polygon for the species after that polygon has been buffered outward by a fixed 250 km margin, computed in a projected equal-area coordinate system (EPSG:5070, USA Contiguous Albers Equal Area Conic). The buffer is applied uniformly across species rather than sized to each species individually. This keeps the boundary condition standardized across the framework and avoids using a species' own centroid velocity, which is an output of the analysis, to set a parameter of the analysis.</w:t>
+        <w:jc w:val="left"/>
+        <w:rPr/>
+      </w:pPr>
+      <w:r>
+        <w:rPr/>
+        <w:t>The modeled extent is a rectangular bounding box enclosing the USGS GAP range polygon for the species after that polygon has been buffered outward by 250 km, computed in a projected equal-area coordinate system (EPSG:5070, USA Contiguous Albers Equal Area Conic). The buffered polygon is species-specific. The distance is not. The same 250 km is used for every species. This keeps the boundary condition standardized and avoids setting a parameter of the analysis from centroid velocity, which the analysis itself produces.</w:t>
       </w:r>
     </w:p>
     <w:p>
@@ -54,22 +55,24 @@
       <w:pPr>
         <w:pStyle w:val="BodyText"/>
         <w:bidi w:val="0"/>
-        <w:rPr/>
-      </w:pPr>
-      <w:r>
-        <w:rPr/>
-        <w:t>The 250 km figure derives from Huang, Sauer, and Dubayah (2017), who tracked the abundance-weighted geographic centroid of 57 permanent resident North American bird species over 44 years using Breeding Bird Survey data and found an average, multidirectional centroid velocity of 5.89 km/yr. Projected across rENM's 45-year study window this gives approximately 265 km, close to the 259 km average displacement that study reports directly over a comparable period. A slightly conservative round figure of 250 km is used.</w:t>
-      </w:r>
-    </w:p>
-    <w:p>
-      <w:pPr>
-        <w:pStyle w:val="BodyText"/>
-        <w:bidi w:val="0"/>
-        <w:rPr/>
-      </w:pPr>
-      <w:r>
-        <w:rPr/>
-        <w:t>This full, multidirectional centroid velocity was chosen over other available bird range-shift estimates that report only a poleward or latitudinal component of movement. rENM computes a full two-dimensional suitability centroid, and the pilot species examined during development did not shift uniformly poleward.</w:t>
+        <w:jc w:val="left"/>
+        <w:rPr/>
+      </w:pPr>
+      <w:r>
+        <w:rPr/>
+        <w:t>The figure derives from Huang, Sauer, and Dubayah (2017), who tracked the abundance-weighted geographic centroid of 57 permanent resident North American bird species over 44 years of Breeding Bird Survey data and found an average multidirectional centroid velocity of 5.89 km/yr. Projected across rENM's 45-year study window this gives approximately 265 km. Huang et al. report a 259 km average displacement directly, over a comparable period. The round figure of 250 km is slightly conservative against both.</w:t>
+      </w:r>
+    </w:p>
+    <w:p>
+      <w:pPr>
+        <w:pStyle w:val="BodyText"/>
+        <w:bidi w:val="0"/>
+        <w:jc w:val="left"/>
+        <w:rPr/>
+      </w:pPr>
+      <w:r>
+        <w:rPr/>
+        <w:t>Other bird range-shift estimates report only a poleward or latitudinal component of movement. The multidirectional figure was chosen because rENM computes a full two-dimensional suitability centroid, and the pilot species examined during development did not shift uniformly poleward.</w:t>
       </w:r>
     </w:p>
     <w:p>
@@ -88,22 +91,24 @@
       <w:pPr>
         <w:pStyle w:val="BodyText"/>
         <w:bidi w:val="0"/>
-        <w:rPr/>
-      </w:pPr>
-      <w:r>
-        <w:rPr/>
-        <w:t>All range-based summary statistics — positive and negative trend percentage, hot spot area and percentage — are computed against the unbuffered GAP range polygon, not against the bounding box. The buffer and its enclosing rectangle exist only to keep the trend surface from being artificially clipped at the historic range edge; they do not redefine what counts as range in the reported tables.</w:t>
-      </w:r>
-    </w:p>
-    <w:p>
-      <w:pPr>
-        <w:pStyle w:val="BodyText"/>
-        <w:bidi w:val="0"/>
-        <w:rPr/>
-      </w:pPr>
-      <w:r>
-        <w:rPr/>
-        <w:t>Trend behavior within the buffer ring itself — the zone lying between the raw GAP polygon and the 250 km buffered polygon — is reported separately as a boundary trend statistic. Comparing the ring against the range interior indicates whether conditions just outside the historic range are improving or deteriorating relative to the range the species occupies, which a static range polygon cannot show.</w:t>
+        <w:jc w:val="left"/>
+        <w:rPr/>
+      </w:pPr>
+      <w:r>
+        <w:rPr/>
+        <w:t>Range-based summary statistics are computed against the unbuffered GAP range polygon, not the bounding box. This covers positive and negative trend percentage, hot spot area, and hot spot percentage. The buffer and its enclosing rectangle keep the trend surface from being clipped at the historic range edge. They do not redefine what counts as range in the reported tables.</w:t>
+      </w:r>
+    </w:p>
+    <w:p>
+      <w:pPr>
+        <w:pStyle w:val="BodyText"/>
+        <w:bidi w:val="0"/>
+        <w:jc w:val="left"/>
+        <w:rPr/>
+      </w:pPr>
+      <w:r>
+        <w:rPr/>
+        <w:t>The buffer ring is the zone between the raw GAP polygon and the 250 km buffered polygon. Trend behavior there is reported separately as a boundary trend statistic. Comparing the ring against the range interior shows whether conditions just outside the historic range are improving or deteriorating relative to the occupied range. A static range polygon cannot show this.</w:t>
       </w:r>
     </w:p>
     <w:p>
@@ -122,22 +127,24 @@
       <w:pPr>
         <w:pStyle w:val="BodyText"/>
         <w:bidi w:val="0"/>
-        <w:rPr/>
-      </w:pPr>
-      <w:r>
-        <w:rPr/>
-        <w:t>The 250 km figure is drawn from permanent resident species specifically, chosen in the source study because a resident species' abundance centroid is a cleaner climate signal than a migrant's, whose breeding and wintering ranges can shift somewhat independently. It may therefore understate or misrepresent the appropriate margin for strongly migratory species. This is a known limitation rather than a resolved one.</w:t>
-      </w:r>
-    </w:p>
-    <w:p>
-      <w:pPr>
-        <w:pStyle w:val="BodyText"/>
-        <w:bidi w:val="0"/>
-        <w:rPr/>
-      </w:pPr>
-      <w:r>
-        <w:rPr/>
-        <w:t>The buffer distance is a provisional, literature-informed default. It should be revisited as more species run through the pipeline and as taxon- or guild-specific velocity estimates become practical to compute internally.</w:t>
+        <w:jc w:val="left"/>
+        <w:rPr/>
+      </w:pPr>
+      <w:r>
+        <w:rPr/>
+        <w:t>The 250 km figure is drawn from permanent resident species. Huang et al. chose residents because a resident species' abundance centroid is a cleaner climate signal than a migrant's, whose breeding and wintering ranges can shift independently. The figure may not suit strongly migratory species.</w:t>
+      </w:r>
+    </w:p>
+    <w:p>
+      <w:pPr>
+        <w:pStyle w:val="BodyText"/>
+        <w:bidi w:val="0"/>
+        <w:jc w:val="left"/>
+        <w:rPr/>
+      </w:pPr>
+      <w:r>
+        <w:rPr/>
+        <w:t>The buffer distance is a provisional default. It should be revisited as more species run through the pipeline and as taxon- or guild-specific velocity estimates become practical to compute internally.</w:t>
       </w:r>
     </w:p>
     <w:p>
@@ -157,6 +164,7 @@
         <w:pStyle w:val="BodyTextref"/>
         <w:bidi w:val="0"/>
         <w:spacing w:before="0" w:after="120"/>
+        <w:jc w:val="left"/>
         <w:rPr/>
       </w:pPr>
       <w:r>
@@ -171,7 +179,7 @@
       <w:pgNumType w:fmt="decimal"/>
       <w:formProt w:val="false"/>
       <w:textDirection w:val="lrTb"/>
-      <w:docGrid w:type="default" w:linePitch="600" w:charSpace="40960"/>
+      <w:docGrid w:type="default" w:linePitch="600" w:charSpace="36864"/>
     </w:sectPr>
   </w:body>
 </w:document>
@@ -200,13 +208,13 @@
     <w:pPr>
       <w:widowControl w:val="false"/>
       <w:bidi w:val="0"/>
-      <w:spacing w:lineRule="auto" w:line="300"/>
-    </w:pPr>
-    <w:rPr>
-      <w:rFonts w:ascii="Calibri;sans-serif" w:hAnsi="Calibri;sans-serif" w:eastAsia="Calibri;sans-serif" w:cs="Calibri;sans-serif"/>
+      <w:spacing w:lineRule="auto" w:line="274"/>
+    </w:pPr>
+    <w:rPr>
+      <w:rFonts w:ascii="Cambria;serif" w:hAnsi="Cambria;serif" w:eastAsia="Cambria;serif" w:cs="Cambria;serif"/>
       <w:color w:val="auto"/>
-      <w:sz w:val="20"/>
-      <w:szCs w:val="20"/>
+      <w:sz w:val="22"/>
+      <w:szCs w:val="22"/>
       <w:lang w:val="en-US" w:eastAsia="zh-CN" w:bidi="hi-IN"/>
     </w:rPr>
   </w:style>
@@ -216,31 +224,32 @@
     <w:next w:val="BodyText"/>
     <w:qFormat/>
     <w:pPr>
-      <w:spacing w:before="240" w:after="240"/>
-    </w:pPr>
-    <w:rPr>
+      <w:spacing w:before="240" w:after="160"/>
+    </w:pPr>
+    <w:rPr>
+      <w:rFonts w:ascii="Calibri;sans-serif" w:hAnsi="Calibri;sans-serif" w:eastAsia="Calibri;sans-serif" w:cs="Calibri;sans-serif"/>
+      <w:b/>
+      <w:bCs/>
+      <w:sz w:val="28"/>
+      <w:szCs w:val="28"/>
+    </w:rPr>
+  </w:style>
+  <w:style w:type="paragraph" w:styleId="Heading2">
+    <w:name w:val="heading 2"/>
+    <w:basedOn w:val="Heading"/>
+    <w:next w:val="BodyText"/>
+    <w:qFormat/>
+    <w:pPr>
+      <w:spacing w:before="180" w:after="40"/>
+      <w:ind w:left="180" w:right="180"/>
+      <w:outlineLvl w:val="1"/>
+    </w:pPr>
+    <w:rPr>
+      <w:rFonts w:ascii="Calibri;sans-serif" w:hAnsi="Calibri;sans-serif" w:eastAsia="Calibri;sans-serif" w:cs="Calibri;sans-serif"/>
       <w:b/>
       <w:bCs/>
       <w:sz w:val="22"/>
       <w:szCs w:val="22"/>
-    </w:rPr>
-  </w:style>
-  <w:style w:type="paragraph" w:styleId="Heading2">
-    <w:name w:val="heading 2"/>
-    <w:basedOn w:val="Heading"/>
-    <w:next w:val="BodyText"/>
-    <w:qFormat/>
-    <w:pPr>
-      <w:spacing w:before="240" w:after="60"/>
-      <w:ind w:left="240" w:right="240"/>
-      <w:outlineLvl w:val="1"/>
-    </w:pPr>
-    <w:rPr>
-      <w:rFonts w:ascii="Liberation Serif" w:hAnsi="Liberation Serif" w:eastAsia="Songti SC" w:cs="Arial Unicode MS"/>
-      <w:b/>
-      <w:bCs/>
-      <w:sz w:val="20"/>
-      <w:szCs w:val="20"/>
     </w:rPr>
   </w:style>
   <w:style w:type="character" w:styleId="EndnoteReference">
@@ -342,7 +351,7 @@
     <w:basedOn w:val="Normal"/>
     <w:pPr>
       <w:spacing w:before="0" w:after="120"/>
-      <w:jc w:val="both"/>
+      <w:jc w:val="left"/>
     </w:pPr>
     <w:rPr/>
   </w:style>

</xml_diff>

<commit_message>
Match the methods note to the narrative section styling
Headings use the narrative section's colours, #365F91 for the section
header and #4F81BD for subsections, over an 11pt Cambria body, flush left.
Authored in Word and exported from it, so the embedded PDF carries real
Calibri and Cambria rather than substitutes, and without the stray heading
indent and malformed font names that the HTML conversion introduced.

Co-Authored-By: Claude Opus 5 <noreply@anthropic.com>
</commit_message>
<xml_diff>
--- a/inst/resources/methods.docx
+++ b/inst/resources/methods.docx
@@ -1,196 +1,155 @@
 
 <file path=word/document.xml><?xml version="1.0" encoding="utf-8"?>
-<w:document xmlns:o="urn:schemas-microsoft-com:office:office" xmlns:r="http://schemas.openxmlformats.org/officeDocument/2006/relationships" xmlns:v="urn:schemas-microsoft-com:vml" xmlns:w="http://schemas.openxmlformats.org/wordprocessingml/2006/main" xmlns:w10="urn:schemas-microsoft-com:office:word" xmlns:wp="http://schemas.openxmlformats.org/drawingml/2006/wordprocessingDrawing" xmlns:pic="http://schemas.openxmlformats.org/drawingml/2006/picture" xmlns:wps="http://schemas.microsoft.com/office/word/2010/wordprocessingShape" xmlns:wpg="http://schemas.microsoft.com/office/word/2010/wordprocessingGroup" xmlns:mc="http://schemas.openxmlformats.org/markup-compatibility/2006" xmlns:wp14="http://schemas.microsoft.com/office/word/2010/wordprocessingDrawing" xmlns:w14="http://schemas.microsoft.com/office/word/2010/wordml" xmlns:w15="http://schemas.microsoft.com/office/word/2012/wordml" mc:Ignorable="w14 wp14 w15">
+<w:document xmlns:wpc="http://schemas.microsoft.com/office/word/2010/wordprocessingCanvas" xmlns:cx="http://schemas.microsoft.com/office/drawing/2014/chartex" xmlns:cx1="http://schemas.microsoft.com/office/drawing/2015/9/8/chartex" xmlns:cx2="http://schemas.microsoft.com/office/drawing/2015/10/21/chartex" xmlns:cx3="http://schemas.microsoft.com/office/drawing/2016/5/9/chartex" xmlns:cx4="http://schemas.microsoft.com/office/drawing/2016/5/10/chartex" xmlns:cx5="http://schemas.microsoft.com/office/drawing/2016/5/11/chartex" xmlns:cx6="http://schemas.microsoft.com/office/drawing/2016/5/12/chartex" xmlns:cx7="http://schemas.microsoft.com/office/drawing/2016/5/13/chartex" xmlns:cx8="http://schemas.microsoft.com/office/drawing/2016/5/14/chartex" xmlns:mc="http://schemas.openxmlformats.org/markup-compatibility/2006" xmlns:m="http://schemas.openxmlformats.org/officeDocument/2006/math" xmlns:aink="http://schemas.microsoft.com/office/drawing/2016/ink" xmlns:am3d="http://schemas.microsoft.com/office/drawing/2017/model3d" xmlns:oel="http://schemas.microsoft.com/office/2019/extlst" xmlns:r="http://schemas.openxmlformats.org/officeDocument/2006/relationships" xmlns:wp14="http://schemas.microsoft.com/office/word/2010/wordprocessingDrawing" xmlns:wp="http://schemas.openxmlformats.org/drawingml/2006/wordprocessingDrawing" xmlns:wpg="http://schemas.microsoft.com/office/word/2010/wordprocessingGroup" xmlns:wpi="http://schemas.microsoft.com/office/word/2010/wordprocessingInk" xmlns:wps="http://schemas.microsoft.com/office/word/2010/wordprocessingShape" xmlns:o="urn:schemas-microsoft-com:office:office" xmlns:v="urn:schemas-microsoft-com:vml" xmlns:w10="urn:schemas-microsoft-com:office:word" xmlns:w="http://schemas.openxmlformats.org/wordprocessingml/2006/main" xmlns:w14="http://schemas.microsoft.com/office/word/2010/wordml" xmlns:w15="http://schemas.microsoft.com/office/word/2012/wordml" xmlns:w16cex="http://schemas.microsoft.com/office/word/2018/wordml/cex" xmlns:w16cid="http://schemas.microsoft.com/office/word/2016/wordml/cid" xmlns:w16="http://schemas.microsoft.com/office/word/2018/wordml" xmlns:w16sdtdh="http://schemas.microsoft.com/office/word/2020/wordml/sdtdatahash" xmlns:w16sdtfl="http://schemas.microsoft.com/office/word/2024/wordml/sdtformatlock" xmlns:w16se="http://schemas.microsoft.com/office/word/2015/wordml/symex" xmlns:w16du="http://schemas.microsoft.com/office/word/2023/wordml/word16du" xmlns:wne="http://schemas.microsoft.com/office/word/2006/wordml" mc:Ignorable="w14 w15 w16se w16cid w16 w16cex w16sdtdh w16sdtfl w16du wp14">
   <w:body>
     <w:p>
       <w:pPr>
         <w:pStyle w:val="Heading1"/>
-        <w:bidi w:val="0"/>
-        <w:spacing w:before="240" w:after="160"/>
-        <w:jc w:val="left"/>
-        <w:rPr/>
-      </w:pPr>
-      <w:r>
-        <w:rPr/>
+      </w:pPr>
+      <w:r>
         <w:t>METHODS: MODELED EXTENT AND BOUNDARY STATISTICS</w:t>
       </w:r>
     </w:p>
     <w:p>
       <w:pPr>
         <w:pStyle w:val="Heading2"/>
-        <w:bidi w:val="0"/>
-        <w:jc w:val="left"/>
-        <w:rPr/>
-      </w:pPr>
-      <w:r>
-        <w:rPr/>
-        <w:t>Modeled extent</w:t>
+      </w:pPr>
+      <w:r>
+        <w:t xml:space="preserve">Modeled </w:t>
+      </w:r>
+      <w:r>
+        <w:t>extent</w:t>
       </w:r>
     </w:p>
     <w:p>
       <w:pPr>
         <w:pStyle w:val="BodyText"/>
-        <w:bidi w:val="0"/>
-        <w:jc w:val="left"/>
-        <w:rPr/>
-      </w:pPr>
-      <w:r>
-        <w:rPr/>
+      </w:pPr>
+      <w:r>
         <w:t>The modeled extent is a rectangular bounding box enclosing the USGS GAP range polygon for the species after that polygon has been buffered outward by 250 km, computed in a projected equal-area coordinate system (EPSG:5070, USA Contiguous Albers Equal Area Conic). The buffered polygon is species-specific. The distance is not. The same 250 km is used for every species. This keeps the boundary condition standardized and avoids setting a parameter of the analysis from centroid velocity, which the analysis itself produces.</w:t>
       </w:r>
     </w:p>
     <w:p>
       <w:pPr>
         <w:pStyle w:val="Heading2"/>
-        <w:bidi w:val="0"/>
-        <w:jc w:val="left"/>
-        <w:rPr/>
-      </w:pPr>
-      <w:r>
-        <w:rPr/>
+      </w:pPr>
+      <w:r>
         <w:t>Derivation of the 250 km buffer</w:t>
       </w:r>
     </w:p>
     <w:p>
       <w:pPr>
         <w:pStyle w:val="BodyText"/>
-        <w:bidi w:val="0"/>
-        <w:jc w:val="left"/>
-        <w:rPr/>
-      </w:pPr>
-      <w:r>
-        <w:rPr/>
-        <w:t>The figure derives from Huang, Sauer, and Dubayah (2017), who tracked the abundance-weighted geographic centroid of 57 permanent resident North American bird species over 44 years of Breeding Bird Survey data and found an average multidirectional centroid velocity of 5.89 km/yr. Projected across rENM's 45-year study window this gives approximately 265 km. Huang et al. report a 259 km average displacement directly, over a comparable period. The round figure of 250 km is slightly conservative against both.</w:t>
+      </w:pPr>
+      <w:r>
+        <w:t xml:space="preserve">The figure derives from Huang, Sauer, and </w:t>
+      </w:r>
+      <w:proofErr w:type="spellStart"/>
+      <w:r>
+        <w:t>Dubayah</w:t>
+      </w:r>
+      <w:proofErr w:type="spellEnd"/>
+      <w:r>
+        <w:t xml:space="preserve"> (2017), who tracked the abundance-weighted geographic centroid of 57 permanent resident North American bird species over 44 years of Breeding Bird Survey data and found an average multidirectional centroid velocity of 5.89 km/yr. Projected across rENM's 45-year study window this gives approximately 265 km. Huang et al. report a 259 km average displacement directly, over a comparable period. The round figure of 250 km is slightly conservative against both.</w:t>
       </w:r>
     </w:p>
     <w:p>
       <w:pPr>
         <w:pStyle w:val="BodyText"/>
-        <w:bidi w:val="0"/>
-        <w:jc w:val="left"/>
-        <w:rPr/>
-      </w:pPr>
-      <w:r>
-        <w:rPr/>
+      </w:pPr>
+      <w:r>
         <w:t>Other bird range-shift estimates report only a poleward or latitudinal component of movement. The multidirectional figure was chosen because rENM computes a full two-dimensional suitability centroid, and the pilot species examined during development did not shift uniformly poleward.</w:t>
       </w:r>
     </w:p>
     <w:p>
       <w:pPr>
         <w:pStyle w:val="Heading2"/>
-        <w:bidi w:val="0"/>
-        <w:jc w:val="left"/>
-        <w:rPr/>
-      </w:pPr>
-      <w:r>
-        <w:rPr/>
+      </w:pPr>
+      <w:r>
         <w:t>What the buffer does and does not affect</w:t>
       </w:r>
     </w:p>
     <w:p>
       <w:pPr>
         <w:pStyle w:val="BodyText"/>
-        <w:bidi w:val="0"/>
-        <w:jc w:val="left"/>
-        <w:rPr/>
-      </w:pPr>
-      <w:r>
-        <w:rPr/>
+      </w:pPr>
+      <w:r>
         <w:t>Range-based summary statistics are computed against the unbuffered GAP range polygon, not the bounding box. This covers positive and negative trend percentage, hot spot area, and hot spot percentage. The buffer and its enclosing rectangle keep the trend surface from being clipped at the historic range edge. They do not redefine what counts as range in the reported tables.</w:t>
       </w:r>
     </w:p>
     <w:p>
       <w:pPr>
         <w:pStyle w:val="BodyText"/>
-        <w:bidi w:val="0"/>
-        <w:jc w:val="left"/>
-        <w:rPr/>
-      </w:pPr>
-      <w:r>
-        <w:rPr/>
+      </w:pPr>
+      <w:r>
         <w:t>The buffer ring is the zone between the raw GAP polygon and the 250 km buffered polygon. Trend behavior there is reported separately as a boundary trend statistic. Comparing the ring against the range interior shows whether conditions just outside the historic range are improving or deteriorating relative to the occupied range. A static range polygon cannot show this.</w:t>
       </w:r>
     </w:p>
     <w:p>
       <w:pPr>
         <w:pStyle w:val="Heading2"/>
-        <w:bidi w:val="0"/>
-        <w:jc w:val="left"/>
-        <w:rPr/>
-      </w:pPr>
-      <w:r>
-        <w:rPr/>
+      </w:pPr>
+      <w:r>
         <w:t>Limitations</w:t>
       </w:r>
     </w:p>
     <w:p>
       <w:pPr>
         <w:pStyle w:val="BodyText"/>
-        <w:bidi w:val="0"/>
-        <w:jc w:val="left"/>
-        <w:rPr/>
-      </w:pPr>
-      <w:r>
-        <w:rPr/>
+      </w:pPr>
+      <w:r>
         <w:t>The 250 km figure is drawn from permanent resident species. Huang et al. chose residents because a resident species' abundance centroid is a cleaner climate signal than a migrant's, whose breeding and wintering ranges can shift independently. The figure may not suit strongly migratory species.</w:t>
       </w:r>
     </w:p>
     <w:p>
       <w:pPr>
         <w:pStyle w:val="BodyText"/>
-        <w:bidi w:val="0"/>
-        <w:jc w:val="left"/>
-        <w:rPr/>
-      </w:pPr>
-      <w:r>
-        <w:rPr/>
+      </w:pPr>
+      <w:r>
         <w:t>The buffer distance is a provisional default. It should be revisited as more species run through the pipeline and as taxon- or guild-specific velocity estimates become practical to compute internally.</w:t>
       </w:r>
     </w:p>
     <w:p>
       <w:pPr>
         <w:pStyle w:val="Heading2"/>
-        <w:bidi w:val="0"/>
-        <w:jc w:val="left"/>
-        <w:rPr/>
-      </w:pPr>
-      <w:r>
-        <w:rPr/>
+      </w:pPr>
+      <w:r>
         <w:t>Reference</w:t>
       </w:r>
     </w:p>
     <w:p>
       <w:pPr>
         <w:pStyle w:val="BodyTextref"/>
-        <w:bidi w:val="0"/>
-        <w:spacing w:before="0" w:after="120"/>
-        <w:jc w:val="left"/>
-        <w:rPr/>
-      </w:pPr>
-      <w:r>
-        <w:rPr/>
-        <w:t>Huang, Q., J. R. Sauer, and R. O. Dubayah. 2017. Multidirectional abundance shifts among North American birds and the relative influence of multifaceted climate factors. Global Change Biology 23:3610–3622. https://doi.org/10.1111/gcb.13683</w:t>
+      </w:pPr>
+      <w:r>
+        <w:t xml:space="preserve">Huang, Q., J. R. Sauer, and R. O. </w:t>
+      </w:r>
+      <w:proofErr w:type="spellStart"/>
+      <w:r>
+        <w:t>Dubayah</w:t>
+      </w:r>
+      <w:proofErr w:type="spellEnd"/>
+      <w:r>
+        <w:t>. 2017. Multidirectional abundance shifts among North American birds and the relative influence of multifaceted climate factors. Global Change Biology 23:3610–3622. https://doi.org/10.1111/gcb.13683</w:t>
       </w:r>
     </w:p>
     <w:sectPr>
-      <w:type w:val="nextPage"/>
       <w:pgSz w:w="12240" w:h="15840"/>
-      <w:pgMar w:left="1440" w:right="1440" w:gutter="0" w:header="0" w:top="1440" w:footer="0" w:bottom="1440"/>
-      <w:pgNumType w:fmt="decimal"/>
-      <w:formProt w:val="false"/>
-      <w:textDirection w:val="lrTb"/>
-      <w:docGrid w:type="default" w:linePitch="600" w:charSpace="36864"/>
+      <w:pgMar w:top="1440" w:right="1440" w:bottom="1440" w:left="1440" w:header="0" w:footer="0" w:gutter="0"/>
+      <w:cols w:space="720"/>
+      <w:formProt w:val="0"/>
+      <w:docGrid w:linePitch="600" w:charSpace="36864"/>
     </w:sectPr>
   </w:body>
 </w:document>
 </file>
 
 <file path=word/styles.xml><?xml version="1.0" encoding="utf-8"?>
-<w:styles xmlns:w="http://schemas.openxmlformats.org/wordprocessingml/2006/main" xmlns:w14="http://schemas.microsoft.com/office/word/2010/wordml" xmlns:mc="http://schemas.openxmlformats.org/markup-compatibility/2006" mc:Ignorable="w14">
+<w:styles xmlns:mc="http://schemas.openxmlformats.org/markup-compatibility/2006" xmlns:r="http://schemas.openxmlformats.org/officeDocument/2006/relationships" xmlns:w="http://schemas.openxmlformats.org/wordprocessingml/2006/main" xmlns:w14="http://schemas.microsoft.com/office/word/2010/wordml" xmlns:w15="http://schemas.microsoft.com/office/word/2012/wordml" xmlns:w16cex="http://schemas.microsoft.com/office/word/2018/wordml/cex" xmlns:w16cid="http://schemas.microsoft.com/office/word/2016/wordml/cid" xmlns:w16="http://schemas.microsoft.com/office/word/2018/wordml" xmlns:w16sdtdh="http://schemas.microsoft.com/office/word/2020/wordml/sdtdatahash" xmlns:w16sdtfl="http://schemas.microsoft.com/office/word/2024/wordml/sdtformatlock" xmlns:w16se="http://schemas.microsoft.com/office/word/2015/wordml/symex" xmlns:w16du="http://schemas.microsoft.com/office/word/2023/wordml/word16du" mc:Ignorable="w14 w15 w16se w16cid w16 w16cex w16sdtdh w16sdtfl w16du">
   <w:docDefaults>
     <w:rPrDefault>
       <w:rPr>
-        <w:rFonts w:ascii="Liberation Serif" w:hAnsi="Liberation Serif" w:eastAsia="Songti SC" w:cs="Arial Unicode MS"/>
+        <w:rFonts w:ascii="Liberation Serif" w:eastAsia="Songti SC" w:hAnsi="Liberation Serif" w:cs="Arial Unicode MS"/>
         <w:sz w:val="24"/>
         <w:szCs w:val="24"/>
         <w:lang w:val="en-US" w:eastAsia="zh-CN" w:bidi="hi-IN"/>
@@ -198,60 +157,467 @@
     </w:rPrDefault>
     <w:pPrDefault>
       <w:pPr>
-        <w:suppressAutoHyphens w:val="true"/>
+        <w:suppressAutoHyphens/>
       </w:pPr>
     </w:pPrDefault>
   </w:docDefaults>
-  <w:style w:type="paragraph" w:styleId="Normal">
+  <w:latentStyles w:defLockedState="0" w:defUIPriority="99" w:defSemiHidden="0" w:defUnhideWhenUsed="0" w:defQFormat="0" w:count="376">
+    <w:lsdException w:name="Normal" w:uiPriority="0" w:qFormat="1"/>
+    <w:lsdException w:name="heading 1" w:uiPriority="9" w:qFormat="1"/>
+    <w:lsdException w:name="heading 2" w:semiHidden="1" w:uiPriority="9" w:unhideWhenUsed="1" w:qFormat="1"/>
+    <w:lsdException w:name="heading 3" w:semiHidden="1" w:uiPriority="9" w:unhideWhenUsed="1" w:qFormat="1"/>
+    <w:lsdException w:name="heading 4" w:semiHidden="1" w:uiPriority="9" w:unhideWhenUsed="1" w:qFormat="1"/>
+    <w:lsdException w:name="heading 5" w:semiHidden="1" w:uiPriority="9" w:unhideWhenUsed="1" w:qFormat="1"/>
+    <w:lsdException w:name="heading 6" w:semiHidden="1" w:uiPriority="9" w:unhideWhenUsed="1" w:qFormat="1"/>
+    <w:lsdException w:name="heading 7" w:semiHidden="1" w:uiPriority="9" w:unhideWhenUsed="1" w:qFormat="1"/>
+    <w:lsdException w:name="heading 8" w:semiHidden="1" w:uiPriority="9" w:unhideWhenUsed="1" w:qFormat="1"/>
+    <w:lsdException w:name="heading 9" w:semiHidden="1" w:uiPriority="9" w:unhideWhenUsed="1" w:qFormat="1"/>
+    <w:lsdException w:name="index 1" w:semiHidden="1" w:unhideWhenUsed="1"/>
+    <w:lsdException w:name="index 2" w:semiHidden="1" w:unhideWhenUsed="1"/>
+    <w:lsdException w:name="index 3" w:semiHidden="1" w:unhideWhenUsed="1"/>
+    <w:lsdException w:name="index 4" w:semiHidden="1" w:unhideWhenUsed="1"/>
+    <w:lsdException w:name="index 5" w:semiHidden="1" w:unhideWhenUsed="1"/>
+    <w:lsdException w:name="index 6" w:semiHidden="1" w:unhideWhenUsed="1"/>
+    <w:lsdException w:name="index 7" w:semiHidden="1" w:unhideWhenUsed="1"/>
+    <w:lsdException w:name="index 8" w:semiHidden="1" w:unhideWhenUsed="1"/>
+    <w:lsdException w:name="index 9" w:semiHidden="1" w:unhideWhenUsed="1"/>
+    <w:lsdException w:name="toc 1" w:semiHidden="1" w:uiPriority="39" w:unhideWhenUsed="1"/>
+    <w:lsdException w:name="toc 2" w:semiHidden="1" w:uiPriority="39" w:unhideWhenUsed="1"/>
+    <w:lsdException w:name="toc 3" w:semiHidden="1" w:uiPriority="39" w:unhideWhenUsed="1"/>
+    <w:lsdException w:name="toc 4" w:semiHidden="1" w:uiPriority="39" w:unhideWhenUsed="1"/>
+    <w:lsdException w:name="toc 5" w:semiHidden="1" w:uiPriority="39" w:unhideWhenUsed="1"/>
+    <w:lsdException w:name="toc 6" w:semiHidden="1" w:uiPriority="39" w:unhideWhenUsed="1"/>
+    <w:lsdException w:name="toc 7" w:semiHidden="1" w:uiPriority="39" w:unhideWhenUsed="1"/>
+    <w:lsdException w:name="toc 8" w:semiHidden="1" w:uiPriority="39" w:unhideWhenUsed="1"/>
+    <w:lsdException w:name="toc 9" w:semiHidden="1" w:uiPriority="39" w:unhideWhenUsed="1"/>
+    <w:lsdException w:name="Normal Indent" w:semiHidden="1" w:unhideWhenUsed="1"/>
+    <w:lsdException w:name="footnote text" w:semiHidden="1" w:unhideWhenUsed="1"/>
+    <w:lsdException w:name="annotation text" w:semiHidden="1" w:unhideWhenUsed="1"/>
+    <w:lsdException w:name="header" w:semiHidden="1" w:unhideWhenUsed="1"/>
+    <w:lsdException w:name="footer" w:semiHidden="1" w:unhideWhenUsed="1"/>
+    <w:lsdException w:name="index heading" w:semiHidden="1" w:unhideWhenUsed="1"/>
+    <w:lsdException w:name="caption" w:semiHidden="1" w:uiPriority="35" w:unhideWhenUsed="1" w:qFormat="1"/>
+    <w:lsdException w:name="table of figures" w:semiHidden="1" w:unhideWhenUsed="1"/>
+    <w:lsdException w:name="envelope address" w:semiHidden="1" w:unhideWhenUsed="1"/>
+    <w:lsdException w:name="envelope return" w:semiHidden="1" w:unhideWhenUsed="1"/>
+    <w:lsdException w:name="footnote reference" w:semiHidden="1" w:unhideWhenUsed="1"/>
+    <w:lsdException w:name="annotation reference" w:semiHidden="1" w:unhideWhenUsed="1"/>
+    <w:lsdException w:name="line number" w:semiHidden="1" w:unhideWhenUsed="1"/>
+    <w:lsdException w:name="page number" w:semiHidden="1" w:unhideWhenUsed="1"/>
+    <w:lsdException w:name="endnote reference" w:semiHidden="1" w:unhideWhenUsed="1"/>
+    <w:lsdException w:name="endnote text" w:semiHidden="1" w:unhideWhenUsed="1"/>
+    <w:lsdException w:name="table of authorities" w:semiHidden="1" w:unhideWhenUsed="1"/>
+    <w:lsdException w:name="macro" w:semiHidden="1" w:unhideWhenUsed="1"/>
+    <w:lsdException w:name="toa heading" w:semiHidden="1" w:unhideWhenUsed="1"/>
+    <w:lsdException w:name="List" w:semiHidden="1" w:unhideWhenUsed="1"/>
+    <w:lsdException w:name="List Bullet" w:semiHidden="1" w:unhideWhenUsed="1"/>
+    <w:lsdException w:name="List Number" w:semiHidden="1" w:unhideWhenUsed="1"/>
+    <w:lsdException w:name="List 2" w:semiHidden="1" w:unhideWhenUsed="1"/>
+    <w:lsdException w:name="List 3" w:semiHidden="1" w:unhideWhenUsed="1"/>
+    <w:lsdException w:name="List 4" w:semiHidden="1" w:unhideWhenUsed="1"/>
+    <w:lsdException w:name="List 5" w:semiHidden="1" w:unhideWhenUsed="1"/>
+    <w:lsdException w:name="List Bullet 2" w:semiHidden="1" w:unhideWhenUsed="1"/>
+    <w:lsdException w:name="List Bullet 3" w:semiHidden="1" w:unhideWhenUsed="1"/>
+    <w:lsdException w:name="List Bullet 4" w:semiHidden="1" w:unhideWhenUsed="1"/>
+    <w:lsdException w:name="List Bullet 5" w:semiHidden="1" w:unhideWhenUsed="1"/>
+    <w:lsdException w:name="List Number 2" w:semiHidden="1" w:unhideWhenUsed="1"/>
+    <w:lsdException w:name="List Number 3" w:semiHidden="1" w:unhideWhenUsed="1"/>
+    <w:lsdException w:name="List Number 4" w:semiHidden="1" w:unhideWhenUsed="1"/>
+    <w:lsdException w:name="List Number 5" w:semiHidden="1" w:unhideWhenUsed="1"/>
+    <w:lsdException w:name="Title" w:uiPriority="10" w:qFormat="1"/>
+    <w:lsdException w:name="Closing" w:semiHidden="1" w:unhideWhenUsed="1"/>
+    <w:lsdException w:name="Signature" w:semiHidden="1" w:unhideWhenUsed="1"/>
+    <w:lsdException w:name="Default Paragraph Font" w:semiHidden="1" w:uiPriority="1" w:unhideWhenUsed="1"/>
+    <w:lsdException w:name="Body Text" w:semiHidden="1" w:unhideWhenUsed="1"/>
+    <w:lsdException w:name="Body Text Indent" w:semiHidden="1" w:unhideWhenUsed="1"/>
+    <w:lsdException w:name="List Continue" w:semiHidden="1" w:unhideWhenUsed="1"/>
+    <w:lsdException w:name="List Continue 2" w:semiHidden="1" w:unhideWhenUsed="1"/>
+    <w:lsdException w:name="List Continue 3" w:semiHidden="1" w:unhideWhenUsed="1"/>
+    <w:lsdException w:name="List Continue 4" w:semiHidden="1" w:unhideWhenUsed="1"/>
+    <w:lsdException w:name="List Continue 5" w:semiHidden="1" w:unhideWhenUsed="1"/>
+    <w:lsdException w:name="Message Header" w:semiHidden="1" w:unhideWhenUsed="1"/>
+    <w:lsdException w:name="Subtitle" w:uiPriority="11" w:qFormat="1"/>
+    <w:lsdException w:name="Salutation" w:semiHidden="1" w:unhideWhenUsed="1"/>
+    <w:lsdException w:name="Date" w:semiHidden="1" w:unhideWhenUsed="1"/>
+    <w:lsdException w:name="Body Text First Indent" w:semiHidden="1" w:unhideWhenUsed="1"/>
+    <w:lsdException w:name="Body Text First Indent 2" w:semiHidden="1" w:unhideWhenUsed="1"/>
+    <w:lsdException w:name="Note Heading" w:semiHidden="1" w:unhideWhenUsed="1"/>
+    <w:lsdException w:name="Body Text 2" w:semiHidden="1" w:unhideWhenUsed="1"/>
+    <w:lsdException w:name="Body Text 3" w:semiHidden="1" w:unhideWhenUsed="1"/>
+    <w:lsdException w:name="Body Text Indent 2" w:semiHidden="1" w:unhideWhenUsed="1"/>
+    <w:lsdException w:name="Body Text Indent 3" w:semiHidden="1" w:unhideWhenUsed="1"/>
+    <w:lsdException w:name="Block Text" w:semiHidden="1" w:unhideWhenUsed="1"/>
+    <w:lsdException w:name="Hyperlink" w:semiHidden="1" w:unhideWhenUsed="1"/>
+    <w:lsdException w:name="FollowedHyperlink" w:semiHidden="1" w:unhideWhenUsed="1"/>
+    <w:lsdException w:name="Strong" w:uiPriority="22" w:qFormat="1"/>
+    <w:lsdException w:name="Emphasis" w:uiPriority="20" w:qFormat="1"/>
+    <w:lsdException w:name="Document Map" w:semiHidden="1" w:unhideWhenUsed="1"/>
+    <w:lsdException w:name="Plain Text" w:semiHidden="1" w:unhideWhenUsed="1"/>
+    <w:lsdException w:name="E-mail Signature" w:semiHidden="1" w:unhideWhenUsed="1"/>
+    <w:lsdException w:name="HTML Top of Form" w:semiHidden="1" w:unhideWhenUsed="1"/>
+    <w:lsdException w:name="HTML Bottom of Form" w:semiHidden="1" w:unhideWhenUsed="1"/>
+    <w:lsdException w:name="Normal (Web)" w:semiHidden="1" w:unhideWhenUsed="1"/>
+    <w:lsdException w:name="HTML Acronym" w:semiHidden="1" w:unhideWhenUsed="1"/>
+    <w:lsdException w:name="HTML Address" w:semiHidden="1" w:unhideWhenUsed="1"/>
+    <w:lsdException w:name="HTML Cite" w:semiHidden="1" w:unhideWhenUsed="1"/>
+    <w:lsdException w:name="HTML Code" w:semiHidden="1" w:unhideWhenUsed="1"/>
+    <w:lsdException w:name="HTML Definition" w:semiHidden="1" w:unhideWhenUsed="1"/>
+    <w:lsdException w:name="HTML Keyboard" w:semiHidden="1" w:unhideWhenUsed="1"/>
+    <w:lsdException w:name="HTML Preformatted" w:semiHidden="1" w:unhideWhenUsed="1"/>
+    <w:lsdException w:name="HTML Sample" w:semiHidden="1" w:unhideWhenUsed="1"/>
+    <w:lsdException w:name="HTML Typewriter" w:semiHidden="1" w:unhideWhenUsed="1"/>
+    <w:lsdException w:name="HTML Variable" w:semiHidden="1" w:unhideWhenUsed="1"/>
+    <w:lsdException w:name="Normal Table" w:semiHidden="1" w:unhideWhenUsed="1"/>
+    <w:lsdException w:name="annotation subject" w:semiHidden="1" w:unhideWhenUsed="1"/>
+    <w:lsdException w:name="No List" w:semiHidden="1" w:unhideWhenUsed="1"/>
+    <w:lsdException w:name="Outline List 1" w:semiHidden="1" w:unhideWhenUsed="1"/>
+    <w:lsdException w:name="Outline List 2" w:semiHidden="1" w:unhideWhenUsed="1"/>
+    <w:lsdException w:name="Outline List 3" w:semiHidden="1" w:unhideWhenUsed="1"/>
+    <w:lsdException w:name="Table Simple 1" w:semiHidden="1" w:unhideWhenUsed="1"/>
+    <w:lsdException w:name="Table Simple 2" w:semiHidden="1" w:unhideWhenUsed="1"/>
+    <w:lsdException w:name="Table Simple 3" w:semiHidden="1" w:unhideWhenUsed="1"/>
+    <w:lsdException w:name="Table Classic 1" w:semiHidden="1" w:unhideWhenUsed="1"/>
+    <w:lsdException w:name="Table Classic 2" w:semiHidden="1" w:unhideWhenUsed="1"/>
+    <w:lsdException w:name="Table Classic 3" w:semiHidden="1" w:unhideWhenUsed="1"/>
+    <w:lsdException w:name="Table Classic 4" w:semiHidden="1" w:unhideWhenUsed="1"/>
+    <w:lsdException w:name="Table Colorful 1" w:semiHidden="1" w:unhideWhenUsed="1"/>
+    <w:lsdException w:name="Table Colorful 2" w:semiHidden="1" w:unhideWhenUsed="1"/>
+    <w:lsdException w:name="Table Colorful 3" w:semiHidden="1" w:unhideWhenUsed="1"/>
+    <w:lsdException w:name="Table Columns 1" w:semiHidden="1" w:unhideWhenUsed="1"/>
+    <w:lsdException w:name="Table Columns 2" w:semiHidden="1" w:unhideWhenUsed="1"/>
+    <w:lsdException w:name="Table Columns 3" w:semiHidden="1" w:unhideWhenUsed="1"/>
+    <w:lsdException w:name="Table Columns 4" w:semiHidden="1" w:unhideWhenUsed="1"/>
+    <w:lsdException w:name="Table Columns 5" w:semiHidden="1" w:unhideWhenUsed="1"/>
+    <w:lsdException w:name="Table Grid 1" w:semiHidden="1" w:unhideWhenUsed="1"/>
+    <w:lsdException w:name="Table Grid 2" w:semiHidden="1" w:unhideWhenUsed="1"/>
+    <w:lsdException w:name="Table Grid 3" w:semiHidden="1" w:unhideWhenUsed="1"/>
+    <w:lsdException w:name="Table Grid 4" w:semiHidden="1" w:unhideWhenUsed="1"/>
+    <w:lsdException w:name="Table Grid 5" w:semiHidden="1" w:unhideWhenUsed="1"/>
+    <w:lsdException w:name="Table Grid 6" w:semiHidden="1" w:unhideWhenUsed="1"/>
+    <w:lsdException w:name="Table Grid 7" w:semiHidden="1" w:unhideWhenUsed="1"/>
+    <w:lsdException w:name="Table Grid 8" w:semiHidden="1" w:unhideWhenUsed="1"/>
+    <w:lsdException w:name="Table List 1" w:semiHidden="1" w:unhideWhenUsed="1"/>
+    <w:lsdException w:name="Table List 2" w:semiHidden="1" w:unhideWhenUsed="1"/>
+    <w:lsdException w:name="Table List 3" w:semiHidden="1" w:unhideWhenUsed="1"/>
+    <w:lsdException w:name="Table List 4" w:semiHidden="1" w:unhideWhenUsed="1"/>
+    <w:lsdException w:name="Table List 5" w:semiHidden="1" w:unhideWhenUsed="1"/>
+    <w:lsdException w:name="Table List 6" w:semiHidden="1" w:unhideWhenUsed="1"/>
+    <w:lsdException w:name="Table List 7" w:semiHidden="1" w:unhideWhenUsed="1"/>
+    <w:lsdException w:name="Table List 8" w:semiHidden="1" w:unhideWhenUsed="1"/>
+    <w:lsdException w:name="Table 3D effects 1" w:semiHidden="1" w:unhideWhenUsed="1"/>
+    <w:lsdException w:name="Table 3D effects 2" w:semiHidden="1" w:unhideWhenUsed="1"/>
+    <w:lsdException w:name="Table 3D effects 3" w:semiHidden="1" w:unhideWhenUsed="1"/>
+    <w:lsdException w:name="Table Contemporary" w:semiHidden="1" w:unhideWhenUsed="1"/>
+    <w:lsdException w:name="Table Elegant" w:semiHidden="1" w:unhideWhenUsed="1"/>
+    <w:lsdException w:name="Table Professional" w:semiHidden="1" w:unhideWhenUsed="1"/>
+    <w:lsdException w:name="Table Subtle 1" w:semiHidden="1" w:unhideWhenUsed="1"/>
+    <w:lsdException w:name="Table Subtle 2" w:semiHidden="1" w:unhideWhenUsed="1"/>
+    <w:lsdException w:name="Table Web 1" w:semiHidden="1" w:unhideWhenUsed="1"/>
+    <w:lsdException w:name="Table Web 2" w:semiHidden="1" w:unhideWhenUsed="1"/>
+    <w:lsdException w:name="Table Web 3" w:semiHidden="1" w:unhideWhenUsed="1"/>
+    <w:lsdException w:name="Balloon Text" w:semiHidden="1" w:unhideWhenUsed="1"/>
+    <w:lsdException w:name="Table Grid" w:uiPriority="39"/>
+    <w:lsdException w:name="Table Theme" w:semiHidden="1" w:unhideWhenUsed="1"/>
+    <w:lsdException w:name="Placeholder Text" w:semiHidden="1"/>
+    <w:lsdException w:name="No Spacing" w:uiPriority="1" w:qFormat="1"/>
+    <w:lsdException w:name="Light Shading" w:uiPriority="60"/>
+    <w:lsdException w:name="Light List" w:uiPriority="61"/>
+    <w:lsdException w:name="Light Grid" w:uiPriority="62"/>
+    <w:lsdException w:name="Medium Shading 1" w:uiPriority="63"/>
+    <w:lsdException w:name="Medium Shading 2" w:uiPriority="64"/>
+    <w:lsdException w:name="Medium List 1" w:uiPriority="65"/>
+    <w:lsdException w:name="Medium List 2" w:uiPriority="66"/>
+    <w:lsdException w:name="Medium Grid 1" w:uiPriority="67"/>
+    <w:lsdException w:name="Medium Grid 2" w:uiPriority="68"/>
+    <w:lsdException w:name="Medium Grid 3" w:uiPriority="69"/>
+    <w:lsdException w:name="Dark List" w:uiPriority="70"/>
+    <w:lsdException w:name="Colorful Shading" w:uiPriority="71"/>
+    <w:lsdException w:name="Colorful List" w:uiPriority="72"/>
+    <w:lsdException w:name="Colorful Grid" w:uiPriority="73"/>
+    <w:lsdException w:name="Light Shading Accent 1" w:uiPriority="60"/>
+    <w:lsdException w:name="Light List Accent 1" w:uiPriority="61"/>
+    <w:lsdException w:name="Light Grid Accent 1" w:uiPriority="62"/>
+    <w:lsdException w:name="Medium Shading 1 Accent 1" w:uiPriority="63"/>
+    <w:lsdException w:name="Medium Shading 2 Accent 1" w:uiPriority="64"/>
+    <w:lsdException w:name="Medium List 1 Accent 1" w:uiPriority="65"/>
+    <w:lsdException w:name="Revision" w:semiHidden="1"/>
+    <w:lsdException w:name="List Paragraph" w:uiPriority="34" w:qFormat="1"/>
+    <w:lsdException w:name="Quote" w:uiPriority="29" w:qFormat="1"/>
+    <w:lsdException w:name="Intense Quote" w:uiPriority="30" w:qFormat="1"/>
+    <w:lsdException w:name="Medium List 2 Accent 1" w:uiPriority="66"/>
+    <w:lsdException w:name="Medium Grid 1 Accent 1" w:uiPriority="67"/>
+    <w:lsdException w:name="Medium Grid 2 Accent 1" w:uiPriority="68"/>
+    <w:lsdException w:name="Medium Grid 3 Accent 1" w:uiPriority="69"/>
+    <w:lsdException w:name="Dark List Accent 1" w:uiPriority="70"/>
+    <w:lsdException w:name="Colorful Shading Accent 1" w:uiPriority="71"/>
+    <w:lsdException w:name="Colorful List Accent 1" w:uiPriority="72"/>
+    <w:lsdException w:name="Colorful Grid Accent 1" w:uiPriority="73"/>
+    <w:lsdException w:name="Light Shading Accent 2" w:uiPriority="60"/>
+    <w:lsdException w:name="Light List Accent 2" w:uiPriority="61"/>
+    <w:lsdException w:name="Light Grid Accent 2" w:uiPriority="62"/>
+    <w:lsdException w:name="Medium Shading 1 Accent 2" w:uiPriority="63"/>
+    <w:lsdException w:name="Medium Shading 2 Accent 2" w:uiPriority="64"/>
+    <w:lsdException w:name="Medium List 1 Accent 2" w:uiPriority="65"/>
+    <w:lsdException w:name="Medium List 2 Accent 2" w:uiPriority="66"/>
+    <w:lsdException w:name="Medium Grid 1 Accent 2" w:uiPriority="67"/>
+    <w:lsdException w:name="Medium Grid 2 Accent 2" w:uiPriority="68"/>
+    <w:lsdException w:name="Medium Grid 3 Accent 2" w:uiPriority="69"/>
+    <w:lsdException w:name="Dark List Accent 2" w:uiPriority="70"/>
+    <w:lsdException w:name="Colorful Shading Accent 2" w:uiPriority="71"/>
+    <w:lsdException w:name="Colorful List Accent 2" w:uiPriority="72"/>
+    <w:lsdException w:name="Colorful Grid Accent 2" w:uiPriority="73"/>
+    <w:lsdException w:name="Light Shading Accent 3" w:uiPriority="60"/>
+    <w:lsdException w:name="Light List Accent 3" w:uiPriority="61"/>
+    <w:lsdException w:name="Light Grid Accent 3" w:uiPriority="62"/>
+    <w:lsdException w:name="Medium Shading 1 Accent 3" w:uiPriority="63"/>
+    <w:lsdException w:name="Medium Shading 2 Accent 3" w:uiPriority="64"/>
+    <w:lsdException w:name="Medium List 1 Accent 3" w:uiPriority="65"/>
+    <w:lsdException w:name="Medium List 2 Accent 3" w:uiPriority="66"/>
+    <w:lsdException w:name="Medium Grid 1 Accent 3" w:uiPriority="67"/>
+    <w:lsdException w:name="Medium Grid 2 Accent 3" w:uiPriority="68"/>
+    <w:lsdException w:name="Medium Grid 3 Accent 3" w:uiPriority="69"/>
+    <w:lsdException w:name="Dark List Accent 3" w:uiPriority="70"/>
+    <w:lsdException w:name="Colorful Shading Accent 3" w:uiPriority="71"/>
+    <w:lsdException w:name="Colorful List Accent 3" w:uiPriority="72"/>
+    <w:lsdException w:name="Colorful Grid Accent 3" w:uiPriority="73"/>
+    <w:lsdException w:name="Light Shading Accent 4" w:uiPriority="60"/>
+    <w:lsdException w:name="Light List Accent 4" w:uiPriority="61"/>
+    <w:lsdException w:name="Light Grid Accent 4" w:uiPriority="62"/>
+    <w:lsdException w:name="Medium Shading 1 Accent 4" w:uiPriority="63"/>
+    <w:lsdException w:name="Medium Shading 2 Accent 4" w:uiPriority="64"/>
+    <w:lsdException w:name="Medium List 1 Accent 4" w:uiPriority="65"/>
+    <w:lsdException w:name="Medium List 2 Accent 4" w:uiPriority="66"/>
+    <w:lsdException w:name="Medium Grid 1 Accent 4" w:uiPriority="67"/>
+    <w:lsdException w:name="Medium Grid 2 Accent 4" w:uiPriority="68"/>
+    <w:lsdException w:name="Medium Grid 3 Accent 4" w:uiPriority="69"/>
+    <w:lsdException w:name="Dark List Accent 4" w:uiPriority="70"/>
+    <w:lsdException w:name="Colorful Shading Accent 4" w:uiPriority="71"/>
+    <w:lsdException w:name="Colorful List Accent 4" w:uiPriority="72"/>
+    <w:lsdException w:name="Colorful Grid Accent 4" w:uiPriority="73"/>
+    <w:lsdException w:name="Light Shading Accent 5" w:uiPriority="60"/>
+    <w:lsdException w:name="Light List Accent 5" w:uiPriority="61"/>
+    <w:lsdException w:name="Light Grid Accent 5" w:uiPriority="62"/>
+    <w:lsdException w:name="Medium Shading 1 Accent 5" w:uiPriority="63"/>
+    <w:lsdException w:name="Medium Shading 2 Accent 5" w:uiPriority="64"/>
+    <w:lsdException w:name="Medium List 1 Accent 5" w:uiPriority="65"/>
+    <w:lsdException w:name="Medium List 2 Accent 5" w:uiPriority="66"/>
+    <w:lsdException w:name="Medium Grid 1 Accent 5" w:uiPriority="67"/>
+    <w:lsdException w:name="Medium Grid 2 Accent 5" w:uiPriority="68"/>
+    <w:lsdException w:name="Medium Grid 3 Accent 5" w:uiPriority="69"/>
+    <w:lsdException w:name="Dark List Accent 5" w:uiPriority="70"/>
+    <w:lsdException w:name="Colorful Shading Accent 5" w:uiPriority="71"/>
+    <w:lsdException w:name="Colorful List Accent 5" w:uiPriority="72"/>
+    <w:lsdException w:name="Colorful Grid Accent 5" w:uiPriority="73"/>
+    <w:lsdException w:name="Light Shading Accent 6" w:uiPriority="60"/>
+    <w:lsdException w:name="Light List Accent 6" w:uiPriority="61"/>
+    <w:lsdException w:name="Light Grid Accent 6" w:uiPriority="62"/>
+    <w:lsdException w:name="Medium Shading 1 Accent 6" w:uiPriority="63"/>
+    <w:lsdException w:name="Medium Shading 2 Accent 6" w:uiPriority="64"/>
+    <w:lsdException w:name="Medium List 1 Accent 6" w:uiPriority="65"/>
+    <w:lsdException w:name="Medium List 2 Accent 6" w:uiPriority="66"/>
+    <w:lsdException w:name="Medium Grid 1 Accent 6" w:uiPriority="67"/>
+    <w:lsdException w:name="Medium Grid 2 Accent 6" w:uiPriority="68"/>
+    <w:lsdException w:name="Medium Grid 3 Accent 6" w:uiPriority="69"/>
+    <w:lsdException w:name="Dark List Accent 6" w:uiPriority="70"/>
+    <w:lsdException w:name="Colorful Shading Accent 6" w:uiPriority="71"/>
+    <w:lsdException w:name="Colorful List Accent 6" w:uiPriority="72"/>
+    <w:lsdException w:name="Colorful Grid Accent 6" w:uiPriority="73"/>
+    <w:lsdException w:name="Subtle Emphasis" w:uiPriority="19" w:qFormat="1"/>
+    <w:lsdException w:name="Intense Emphasis" w:uiPriority="21" w:qFormat="1"/>
+    <w:lsdException w:name="Subtle Reference" w:uiPriority="31" w:qFormat="1"/>
+    <w:lsdException w:name="Intense Reference" w:uiPriority="32" w:qFormat="1"/>
+    <w:lsdException w:name="Book Title" w:uiPriority="33" w:qFormat="1"/>
+    <w:lsdException w:name="Bibliography" w:semiHidden="1" w:uiPriority="37" w:unhideWhenUsed="1"/>
+    <w:lsdException w:name="TOC Heading" w:semiHidden="1" w:uiPriority="39" w:unhideWhenUsed="1" w:qFormat="1"/>
+    <w:lsdException w:name="Plain Table 1" w:uiPriority="41"/>
+    <w:lsdException w:name="Plain Table 2" w:uiPriority="42"/>
+    <w:lsdException w:name="Plain Table 3" w:uiPriority="43"/>
+    <w:lsdException w:name="Plain Table 4" w:uiPriority="44"/>
+    <w:lsdException w:name="Plain Table 5" w:uiPriority="45"/>
+    <w:lsdException w:name="Grid Table Light" w:uiPriority="40"/>
+    <w:lsdException w:name="Grid Table 1 Light" w:uiPriority="46"/>
+    <w:lsdException w:name="Grid Table 2" w:uiPriority="47"/>
+    <w:lsdException w:name="Grid Table 3" w:uiPriority="48"/>
+    <w:lsdException w:name="Grid Table 4" w:uiPriority="49"/>
+    <w:lsdException w:name="Grid Table 5 Dark" w:uiPriority="50"/>
+    <w:lsdException w:name="Grid Table 6 Colorful" w:uiPriority="51"/>
+    <w:lsdException w:name="Grid Table 7 Colorful" w:uiPriority="52"/>
+    <w:lsdException w:name="Grid Table 1 Light Accent 1" w:uiPriority="46"/>
+    <w:lsdException w:name="Grid Table 2 Accent 1" w:uiPriority="47"/>
+    <w:lsdException w:name="Grid Table 3 Accent 1" w:uiPriority="48"/>
+    <w:lsdException w:name="Grid Table 4 Accent 1" w:uiPriority="49"/>
+    <w:lsdException w:name="Grid Table 5 Dark Accent 1" w:uiPriority="50"/>
+    <w:lsdException w:name="Grid Table 6 Colorful Accent 1" w:uiPriority="51"/>
+    <w:lsdException w:name="Grid Table 7 Colorful Accent 1" w:uiPriority="52"/>
+    <w:lsdException w:name="Grid Table 1 Light Accent 2" w:uiPriority="46"/>
+    <w:lsdException w:name="Grid Table 2 Accent 2" w:uiPriority="47"/>
+    <w:lsdException w:name="Grid Table 3 Accent 2" w:uiPriority="48"/>
+    <w:lsdException w:name="Grid Table 4 Accent 2" w:uiPriority="49"/>
+    <w:lsdException w:name="Grid Table 5 Dark Accent 2" w:uiPriority="50"/>
+    <w:lsdException w:name="Grid Table 6 Colorful Accent 2" w:uiPriority="51"/>
+    <w:lsdException w:name="Grid Table 7 Colorful Accent 2" w:uiPriority="52"/>
+    <w:lsdException w:name="Grid Table 1 Light Accent 3" w:uiPriority="46"/>
+    <w:lsdException w:name="Grid Table 2 Accent 3" w:uiPriority="47"/>
+    <w:lsdException w:name="Grid Table 3 Accent 3" w:uiPriority="48"/>
+    <w:lsdException w:name="Grid Table 4 Accent 3" w:uiPriority="49"/>
+    <w:lsdException w:name="Grid Table 5 Dark Accent 3" w:uiPriority="50"/>
+    <w:lsdException w:name="Grid Table 6 Colorful Accent 3" w:uiPriority="51"/>
+    <w:lsdException w:name="Grid Table 7 Colorful Accent 3" w:uiPriority="52"/>
+    <w:lsdException w:name="Grid Table 1 Light Accent 4" w:uiPriority="46"/>
+    <w:lsdException w:name="Grid Table 2 Accent 4" w:uiPriority="47"/>
+    <w:lsdException w:name="Grid Table 3 Accent 4" w:uiPriority="48"/>
+    <w:lsdException w:name="Grid Table 4 Accent 4" w:uiPriority="49"/>
+    <w:lsdException w:name="Grid Table 5 Dark Accent 4" w:uiPriority="50"/>
+    <w:lsdException w:name="Grid Table 6 Colorful Accent 4" w:uiPriority="51"/>
+    <w:lsdException w:name="Grid Table 7 Colorful Accent 4" w:uiPriority="52"/>
+    <w:lsdException w:name="Grid Table 1 Light Accent 5" w:uiPriority="46"/>
+    <w:lsdException w:name="Grid Table 2 Accent 5" w:uiPriority="47"/>
+    <w:lsdException w:name="Grid Table 3 Accent 5" w:uiPriority="48"/>
+    <w:lsdException w:name="Grid Table 4 Accent 5" w:uiPriority="49"/>
+    <w:lsdException w:name="Grid Table 5 Dark Accent 5" w:uiPriority="50"/>
+    <w:lsdException w:name="Grid Table 6 Colorful Accent 5" w:uiPriority="51"/>
+    <w:lsdException w:name="Grid Table 7 Colorful Accent 5" w:uiPriority="52"/>
+    <w:lsdException w:name="Grid Table 1 Light Accent 6" w:uiPriority="46"/>
+    <w:lsdException w:name="Grid Table 2 Accent 6" w:uiPriority="47"/>
+    <w:lsdException w:name="Grid Table 3 Accent 6" w:uiPriority="48"/>
+    <w:lsdException w:name="Grid Table 4 Accent 6" w:uiPriority="49"/>
+    <w:lsdException w:name="Grid Table 5 Dark Accent 6" w:uiPriority="50"/>
+    <w:lsdException w:name="Grid Table 6 Colorful Accent 6" w:uiPriority="51"/>
+    <w:lsdException w:name="Grid Table 7 Colorful Accent 6" w:uiPriority="52"/>
+    <w:lsdException w:name="List Table 1 Light" w:uiPriority="46"/>
+    <w:lsdException w:name="List Table 2" w:uiPriority="47"/>
+    <w:lsdException w:name="List Table 3" w:uiPriority="48"/>
+    <w:lsdException w:name="List Table 4" w:uiPriority="49"/>
+    <w:lsdException w:name="List Table 5 Dark" w:uiPriority="50"/>
+    <w:lsdException w:name="List Table 6 Colorful" w:uiPriority="51"/>
+    <w:lsdException w:name="List Table 7 Colorful" w:uiPriority="52"/>
+    <w:lsdException w:name="List Table 1 Light Accent 1" w:uiPriority="46"/>
+    <w:lsdException w:name="List Table 2 Accent 1" w:uiPriority="47"/>
+    <w:lsdException w:name="List Table 3 Accent 1" w:uiPriority="48"/>
+    <w:lsdException w:name="List Table 4 Accent 1" w:uiPriority="49"/>
+    <w:lsdException w:name="List Table 5 Dark Accent 1" w:uiPriority="50"/>
+    <w:lsdException w:name="List Table 6 Colorful Accent 1" w:uiPriority="51"/>
+    <w:lsdException w:name="List Table 7 Colorful Accent 1" w:uiPriority="52"/>
+    <w:lsdException w:name="List Table 1 Light Accent 2" w:uiPriority="46"/>
+    <w:lsdException w:name="List Table 2 Accent 2" w:uiPriority="47"/>
+    <w:lsdException w:name="List Table 3 Accent 2" w:uiPriority="48"/>
+    <w:lsdException w:name="List Table 4 Accent 2" w:uiPriority="49"/>
+    <w:lsdException w:name="List Table 5 Dark Accent 2" w:uiPriority="50"/>
+    <w:lsdException w:name="List Table 6 Colorful Accent 2" w:uiPriority="51"/>
+    <w:lsdException w:name="List Table 7 Colorful Accent 2" w:uiPriority="52"/>
+    <w:lsdException w:name="List Table 1 Light Accent 3" w:uiPriority="46"/>
+    <w:lsdException w:name="List Table 2 Accent 3" w:uiPriority="47"/>
+    <w:lsdException w:name="List Table 3 Accent 3" w:uiPriority="48"/>
+    <w:lsdException w:name="List Table 4 Accent 3" w:uiPriority="49"/>
+    <w:lsdException w:name="List Table 5 Dark Accent 3" w:uiPriority="50"/>
+    <w:lsdException w:name="List Table 6 Colorful Accent 3" w:uiPriority="51"/>
+    <w:lsdException w:name="List Table 7 Colorful Accent 3" w:uiPriority="52"/>
+    <w:lsdException w:name="List Table 1 Light Accent 4" w:uiPriority="46"/>
+    <w:lsdException w:name="List Table 2 Accent 4" w:uiPriority="47"/>
+    <w:lsdException w:name="List Table 3 Accent 4" w:uiPriority="48"/>
+    <w:lsdException w:name="List Table 4 Accent 4" w:uiPriority="49"/>
+    <w:lsdException w:name="List Table 5 Dark Accent 4" w:uiPriority="50"/>
+    <w:lsdException w:name="List Table 6 Colorful Accent 4" w:uiPriority="51"/>
+    <w:lsdException w:name="List Table 7 Colorful Accent 4" w:uiPriority="52"/>
+    <w:lsdException w:name="List Table 1 Light Accent 5" w:uiPriority="46"/>
+    <w:lsdException w:name="List Table 2 Accent 5" w:uiPriority="47"/>
+    <w:lsdException w:name="List Table 3 Accent 5" w:uiPriority="48"/>
+    <w:lsdException w:name="List Table 4 Accent 5" w:uiPriority="49"/>
+    <w:lsdException w:name="List Table 5 Dark Accent 5" w:uiPriority="50"/>
+    <w:lsdException w:name="List Table 6 Colorful Accent 5" w:uiPriority="51"/>
+    <w:lsdException w:name="List Table 7 Colorful Accent 5" w:uiPriority="52"/>
+    <w:lsdException w:name="List Table 1 Light Accent 6" w:uiPriority="46"/>
+    <w:lsdException w:name="List Table 2 Accent 6" w:uiPriority="47"/>
+    <w:lsdException w:name="List Table 3 Accent 6" w:uiPriority="48"/>
+    <w:lsdException w:name="List Table 4 Accent 6" w:uiPriority="49"/>
+    <w:lsdException w:name="List Table 5 Dark Accent 6" w:uiPriority="50"/>
+    <w:lsdException w:name="List Table 6 Colorful Accent 6" w:uiPriority="51"/>
+    <w:lsdException w:name="List Table 7 Colorful Accent 6" w:uiPriority="52"/>
+    <w:lsdException w:name="Mention" w:semiHidden="1" w:unhideWhenUsed="1"/>
+    <w:lsdException w:name="Smart Hyperlink" w:semiHidden="1" w:unhideWhenUsed="1"/>
+    <w:lsdException w:name="Hashtag" w:semiHidden="1" w:unhideWhenUsed="1"/>
+    <w:lsdException w:name="Unresolved Mention" w:semiHidden="1" w:unhideWhenUsed="1"/>
+    <w:lsdException w:name="Smart Link" w:semiHidden="1" w:unhideWhenUsed="1"/>
+  </w:latentStyles>
+  <w:style w:type="paragraph" w:default="1" w:styleId="Normal">
     <w:name w:val="Normal"/>
     <w:qFormat/>
     <w:pPr>
-      <w:widowControl w:val="false"/>
-      <w:bidi w:val="0"/>
-      <w:spacing w:lineRule="auto" w:line="274"/>
+      <w:widowControl w:val="0"/>
+      <w:spacing w:line="274" w:lineRule="auto"/>
     </w:pPr>
     <w:rPr>
-      <w:rFonts w:ascii="Cambria;serif" w:hAnsi="Cambria;serif" w:eastAsia="Cambria;serif" w:cs="Cambria;serif"/>
-      <w:color w:val="auto"/>
+      <w:rFonts w:ascii="Cambria" w:eastAsia="Cambria" w:hAnsi="Cambria" w:cs="Cambria"/>
       <w:sz w:val="22"/>
       <w:szCs w:val="22"/>
-      <w:lang w:val="en-US" w:eastAsia="zh-CN" w:bidi="hi-IN"/>
     </w:rPr>
   </w:style>
   <w:style w:type="paragraph" w:styleId="Heading1">
     <w:name w:val="heading 1"/>
     <w:basedOn w:val="Heading"/>
     <w:next w:val="BodyText"/>
+    <w:uiPriority w:val="9"/>
     <w:qFormat/>
     <w:pPr>
-      <w:spacing w:before="240" w:after="160"/>
+      <w:spacing w:after="160"/>
+      <w:outlineLvl w:val="0"/>
     </w:pPr>
     <w:rPr>
-      <w:rFonts w:ascii="Calibri;sans-serif" w:hAnsi="Calibri;sans-serif" w:eastAsia="Calibri;sans-serif" w:cs="Calibri;sans-serif"/>
+      <w:rFonts w:ascii="Calibri" w:eastAsia="Calibri" w:hAnsi="Calibri" w:cs="Calibri"/>
       <w:b/>
       <w:bCs/>
-      <w:sz w:val="28"/>
-      <w:szCs w:val="28"/>
+      <w:color w:val="365F91"/>
     </w:rPr>
   </w:style>
   <w:style w:type="paragraph" w:styleId="Heading2">
     <w:name w:val="heading 2"/>
     <w:basedOn w:val="Heading"/>
     <w:next w:val="BodyText"/>
-    <w:qFormat/>
+    <w:uiPriority w:val="9"/>
+    <w:unhideWhenUsed/>
+    <w:qFormat/>
+    <w:rsid w:val="00CE0832"/>
     <w:pPr>
-      <w:spacing w:before="180" w:after="40"/>
-      <w:ind w:left="180" w:right="180"/>
+      <w:spacing w:after="40" w:line="240" w:lineRule="auto"/>
+      <w:ind w:right="187"/>
       <w:outlineLvl w:val="1"/>
     </w:pPr>
     <w:rPr>
-      <w:rFonts w:ascii="Calibri;sans-serif" w:hAnsi="Calibri;sans-serif" w:eastAsia="Calibri;sans-serif" w:cs="Calibri;sans-serif"/>
+      <w:rFonts w:ascii="Calibri" w:eastAsia="Calibri" w:hAnsi="Calibri" w:cs="Calibri"/>
       <w:b/>
       <w:bCs/>
+      <w:color w:val="4F81BD"/>
       <w:sz w:val="22"/>
       <w:szCs w:val="22"/>
     </w:rPr>
   </w:style>
+  <w:style w:type="character" w:default="1" w:styleId="DefaultParagraphFont">
+    <w:name w:val="Default Paragraph Font"/>
+    <w:uiPriority w:val="1"/>
+    <w:semiHidden/>
+    <w:unhideWhenUsed/>
+  </w:style>
+  <w:style w:type="table" w:default="1" w:styleId="TableNormal">
+    <w:name w:val="Normal Table"/>
+    <w:uiPriority w:val="99"/>
+    <w:semiHidden/>
+    <w:unhideWhenUsed/>
+    <w:tblPr>
+      <w:tblInd w:w="0" w:type="dxa"/>
+      <w:tblCellMar>
+        <w:top w:w="0" w:type="dxa"/>
+        <w:left w:w="108" w:type="dxa"/>
+        <w:bottom w:w="0" w:type="dxa"/>
+        <w:right w:w="108" w:type="dxa"/>
+      </w:tblCellMar>
+    </w:tblPr>
+  </w:style>
+  <w:style w:type="numbering" w:default="1" w:styleId="NoList">
+    <w:name w:val="No List"/>
+    <w:uiPriority w:val="99"/>
+    <w:semiHidden/>
+    <w:unhideWhenUsed/>
+  </w:style>
   <w:style w:type="character" w:styleId="EndnoteReference">
     <w:name w:val="endnote reference"/>
     <w:rPr>
@@ -264,15 +630,13 @@
       <w:vertAlign w:val="superscript"/>
     </w:rPr>
   </w:style>
-  <w:style w:type="character" w:styleId="EndnoteCharacters">
+  <w:style w:type="character" w:customStyle="1" w:styleId="EndnoteCharacters">
     <w:name w:val="Endnote Characters"/>
     <w:qFormat/>
-    <w:rPr/>
-  </w:style>
-  <w:style w:type="character" w:styleId="FootnoteCharacters">
+  </w:style>
+  <w:style w:type="character" w:customStyle="1" w:styleId="FootnoteCharacters">
     <w:name w:val="Footnote Characters"/>
     <w:qFormat/>
-    <w:rPr/>
   </w:style>
   <w:style w:type="character" w:styleId="Hyperlink">
     <w:name w:val="Hyperlink"/>
@@ -281,7 +645,7 @@
       <w:u w:val="single"/>
     </w:rPr>
   </w:style>
-  <w:style w:type="paragraph" w:styleId="HorizontalLine">
+  <w:style w:type="paragraph" w:customStyle="1" w:styleId="HorizontalLine">
     <w:name w:val="Horizontal Line"/>
     <w:basedOn w:val="Normal"/>
     <w:next w:val="BodyText"/>
@@ -290,7 +654,7 @@
       <w:pBdr>
         <w:bottom w:val="double" w:sz="2" w:space="0" w:color="808080"/>
       </w:pBdr>
-      <w:spacing w:before="0" w:after="283"/>
+      <w:spacing w:after="283"/>
     </w:pPr>
     <w:rPr>
       <w:sz w:val="12"/>
@@ -299,19 +663,16 @@
   <w:style w:type="paragraph" w:styleId="EnvelopeReturn">
     <w:name w:val="envelope return"/>
     <w:basedOn w:val="Normal"/>
-    <w:pPr/>
     <w:rPr>
       <w:i/>
     </w:rPr>
   </w:style>
-  <w:style w:type="paragraph" w:styleId="TableContents">
+  <w:style w:type="paragraph" w:customStyle="1" w:styleId="TableContents">
     <w:name w:val="Table Contents"/>
     <w:basedOn w:val="BodyText"/>
     <w:qFormat/>
-    <w:pPr/>
-    <w:rPr/>
-  </w:style>
-  <w:style w:type="paragraph" w:styleId="Index">
+  </w:style>
+  <w:style w:type="paragraph" w:customStyle="1" w:styleId="Index">
     <w:name w:val="Index"/>
     <w:basedOn w:val="Normal"/>
     <w:qFormat/>
@@ -341,7 +702,6 @@
   <w:style w:type="paragraph" w:styleId="List">
     <w:name w:val="List"/>
     <w:basedOn w:val="BodyText"/>
-    <w:pPr/>
     <w:rPr>
       <w:rFonts w:cs="Arial Unicode MS"/>
     </w:rPr>
@@ -350,18 +710,16 @@
     <w:name w:val="Body Text"/>
     <w:basedOn w:val="Normal"/>
     <w:pPr>
-      <w:spacing w:before="0" w:after="120"/>
-      <w:jc w:val="left"/>
+      <w:spacing w:after="120"/>
     </w:pPr>
-    <w:rPr/>
-  </w:style>
-  <w:style w:type="paragraph" w:styleId="Heading">
+  </w:style>
+  <w:style w:type="paragraph" w:customStyle="1" w:styleId="Heading">
     <w:name w:val="Heading"/>
     <w:basedOn w:val="Normal"/>
     <w:next w:val="BodyText"/>
     <w:qFormat/>
     <w:pPr>
-      <w:keepNext w:val="true"/>
+      <w:keepNext/>
       <w:spacing w:before="240" w:after="283"/>
     </w:pPr>
     <w:rPr>
@@ -370,69 +728,68 @@
       <w:szCs w:val="28"/>
     </w:rPr>
   </w:style>
-  <w:style w:type="paragraph" w:styleId="BodyTextref">
+  <w:style w:type="paragraph" w:customStyle="1" w:styleId="BodyTextref">
     <w:name w:val="Body Text.ref"/>
     <w:basedOn w:val="BodyText"/>
     <w:qFormat/>
     <w:pPr>
-      <w:ind w:hanging="720" w:left="720"/>
+      <w:ind w:left="720" w:hanging="720"/>
     </w:pPr>
-    <w:rPr/>
   </w:style>
 </w:styles>
 </file>
 
 <file path=word/theme/theme1.xml><?xml version="1.0" encoding="utf-8"?>
-<a:theme xmlns:a="http://schemas.openxmlformats.org/drawingml/2006/main" xmlns:r="http://schemas.openxmlformats.org/officeDocument/2006/relationships" name="Office">
+<a:theme xmlns:a="http://schemas.openxmlformats.org/drawingml/2006/main" name="Office">
   <a:themeElements>
     <a:clrScheme name="LibreOffice">
       <a:dk1>
         <a:srgbClr val="000000"/>
       </a:dk1>
       <a:lt1>
-        <a:srgbClr val="ffffff"/>
+        <a:srgbClr val="FFFFFF"/>
       </a:lt1>
       <a:dk2>
         <a:srgbClr val="000000"/>
       </a:dk2>
       <a:lt2>
-        <a:srgbClr val="ffffff"/>
+        <a:srgbClr val="FFFFFF"/>
       </a:lt2>
       <a:accent1>
-        <a:srgbClr val="18a303"/>
+        <a:srgbClr val="18A303"/>
       </a:accent1>
       <a:accent2>
-        <a:srgbClr val="0369a3"/>
+        <a:srgbClr val="0369A3"/>
       </a:accent2>
       <a:accent3>
-        <a:srgbClr val="a33e03"/>
+        <a:srgbClr val="A33E03"/>
       </a:accent3>
       <a:accent4>
-        <a:srgbClr val="8e03a3"/>
+        <a:srgbClr val="8E03A3"/>
       </a:accent4>
       <a:accent5>
-        <a:srgbClr val="c99c00"/>
+        <a:srgbClr val="C99C00"/>
       </a:accent5>
       <a:accent6>
-        <a:srgbClr val="c9211e"/>
+        <a:srgbClr val="C9211E"/>
       </a:accent6>
       <a:hlink>
-        <a:srgbClr val="0000ee"/>
+        <a:srgbClr val="0000EE"/>
       </a:hlink>
       <a:folHlink>
-        <a:srgbClr val="551a8b"/>
+        <a:srgbClr val="551A8B"/>
       </a:folHlink>
     </a:clrScheme>
     <a:fontScheme name="Office">
       <a:majorFont>
-        <a:latin typeface="Arial" pitchFamily="0" charset="1"/>
-        <a:ea typeface="DejaVu Sans" pitchFamily="0" charset="1"/>
-        <a:cs typeface="DejaVu Sans" pitchFamily="0" charset="1"/>
+        <a:latin typeface="Arial"/>
+        <a:ea typeface="DejaVu Sans"/>
+        <a:cs typeface="DejaVu Sans"/>
       </a:majorFont>
       <a:minorFont>
-        <a:latin typeface="Arial" pitchFamily="0" charset="1"/>
-        <a:ea typeface="DejaVu Sans" pitchFamily="0" charset="1"/>
-        <a:cs typeface="DejaVu Sans" pitchFamily="0" charset="1"/>
+        <a:latin typeface="Arial"/>
+        <a:ea typeface="DejaVu Sans"/>
+        <a:cs typeface="DejaVu Sans"/>
       </a:minorFont>
     </a:fontScheme>
     <a:fmtScheme>
@@ -485,5 +842,7 @@
       </a:bgFillStyleLst>
     </a:fmtScheme>
   </a:themeElements>
+  <a:objectDefaults/>
+  <a:extraClrSchemeLst/>
 </a:theme>
 </file>
</xml_diff>

<commit_message>
Methods note: models are fitted on land only
Co-Authored-By: Claude Opus 5.5 <noreply@anthropic.com>
</commit_message>
<xml_diff>
--- a/inst/resources/methods.docx
+++ b/inst/resources/methods.docx
@@ -74,7 +74,7 @@
         <w:pStyle w:val="BodyText"/>
       </w:pPr>
       <w:r>
-        <w:t>Range-based summary statistics are computed against the unbuffered GAP range polygon, not the bounding box. This covers positive and negative trend percentage, hot spot area, and hot spot percentage. The buffer and its enclosing rectangle keep the trend surface from being clipped at the historic range edge. They do not redefine what counts as range in the reported tables.</w:t>
+        <w:t>Range-based summary statistics are computed against the unbuffered GAP range polygon, not the bounding box. This covers positive and negative trend percentage, hot spot area, and hot spot percentage. The buffer and its enclosing rectangle keep the trend surface from being clipped at the historic range edge. They do not redefine what counts as range in the reported tables. Models are fitted on land only, so open water counts toward no area or percentage.</w:t>
       </w:r>
     </w:p>
     <w:p>
@@ -135,7 +135,7 @@
     </w:p>
     <w:sectPr>
       <w:pgSz w:w="12240" w:h="15840"/>
-      <w:pgMar w:top="1440" w:right="1440" w:bottom="1440" w:left="1440" w:header="0" w:footer="0" w:gutter="0"/>
+      <w:pgMar w:top="1296" w:right="1440" w:bottom="1296" w:left="1440" w:header="0" w:footer="0" w:gutter="0"/>
       <w:cols w:space="720"/>
       <w:formProt w:val="0"/>
       <w:docGrid w:linePitch="600" w:charSpace="36864"/>

</xml_diff>